<commit_message>
cap nhat tien do 21/03
</commit_message>
<xml_diff>
--- a/MÔ TẢ NGHIỆP VỤ BÀI TOÁN HỆ THỐNG QUẢN LÝ VẬN TẢI.docx
+++ b/MÔ TẢ NGHIỆP VỤ BÀI TOÁN HỆ THỐNG QUẢN LÝ VẬN TẢI.docx
@@ -728,14 +728,16 @@
           <w:color w:val="000000" w:themeColor="text1"/>
           <w:sz w:val="28"/>
           <w:szCs w:val="28"/>
-        </w:rPr>
-      </w:pPr>
-      <w:r>
-        <w:rPr>
-          <w:rFonts w:ascii="Times New Roman" w:hAnsi="Times New Roman" w:cs="Times New Roman"/>
-          <w:color w:val="000000" w:themeColor="text1"/>
-          <w:sz w:val="28"/>
-          <w:szCs w:val="28"/>
+          <w:lang w:val="vi-VN"/>
+        </w:rPr>
+      </w:pPr>
+      <w:r>
+        <w:rPr>
+          <w:rFonts w:ascii="Times New Roman" w:hAnsi="Times New Roman" w:cs="Times New Roman"/>
+          <w:color w:val="000000" w:themeColor="text1"/>
+          <w:sz w:val="28"/>
+          <w:szCs w:val="28"/>
+          <w:lang w:val="vi-VN"/>
         </w:rPr>
         <w:t>2.2.5. Quản lý phương tiện</w:t>
       </w:r>
@@ -750,14 +752,16 @@
           <w:color w:val="000000" w:themeColor="text1"/>
           <w:sz w:val="28"/>
           <w:szCs w:val="28"/>
-        </w:rPr>
-      </w:pPr>
-      <w:r>
-        <w:rPr>
-          <w:rFonts w:ascii="Times New Roman" w:hAnsi="Times New Roman" w:cs="Times New Roman"/>
-          <w:color w:val="000000" w:themeColor="text1"/>
-          <w:sz w:val="28"/>
-          <w:szCs w:val="28"/>
+          <w:lang w:val="vi-VN"/>
+        </w:rPr>
+      </w:pPr>
+      <w:r>
+        <w:rPr>
+          <w:rFonts w:ascii="Times New Roman" w:hAnsi="Times New Roman" w:cs="Times New Roman"/>
+          <w:color w:val="000000" w:themeColor="text1"/>
+          <w:sz w:val="28"/>
+          <w:szCs w:val="28"/>
+          <w:lang w:val="vi-VN"/>
         </w:rPr>
         <w:t>Mô tả tổng quát: Nghiệp vụ này quản lý toàn bộ "tài sản vận hành" của doanh nghiệp. Hệ thống không chỉ lưu trữ thông tin cơ bản mà còn phân loại phương tiện chi tiết theo năng lực vận tải, giúp bộ phận điều hành lựa chọn đúng loại xe cho từng đơn hàng, từ đó tối ưu hóa tải trọng và giảm thiểu tiêu hao nhiên liệu.</w:t>
       </w:r>
@@ -771,14 +775,16 @@
           <w:color w:val="000000" w:themeColor="text1"/>
           <w:sz w:val="28"/>
           <w:szCs w:val="28"/>
-        </w:rPr>
-      </w:pPr>
-      <w:r>
-        <w:rPr>
-          <w:rFonts w:ascii="Times New Roman" w:hAnsi="Times New Roman" w:cs="Times New Roman"/>
-          <w:color w:val="000000" w:themeColor="text1"/>
-          <w:sz w:val="28"/>
-          <w:szCs w:val="28"/>
+          <w:lang w:val="vi-VN"/>
+        </w:rPr>
+      </w:pPr>
+      <w:r>
+        <w:rPr>
+          <w:rFonts w:ascii="Times New Roman" w:hAnsi="Times New Roman" w:cs="Times New Roman"/>
+          <w:color w:val="000000" w:themeColor="text1"/>
+          <w:sz w:val="28"/>
+          <w:szCs w:val="28"/>
+          <w:lang w:val="vi-VN"/>
         </w:rPr>
         <w:t>Các quy trình nghiệp vụ chi tiết:</w:t>
       </w:r>
@@ -796,14 +802,16 @@
           <w:color w:val="000000" w:themeColor="text1"/>
           <w:sz w:val="28"/>
           <w:szCs w:val="28"/>
-        </w:rPr>
-      </w:pPr>
-      <w:r>
-        <w:rPr>
-          <w:rFonts w:ascii="Times New Roman" w:hAnsi="Times New Roman" w:cs="Times New Roman"/>
-          <w:color w:val="000000" w:themeColor="text1"/>
-          <w:sz w:val="28"/>
-          <w:szCs w:val="28"/>
+          <w:lang w:val="vi-VN"/>
+        </w:rPr>
+      </w:pPr>
+      <w:r>
+        <w:rPr>
+          <w:rFonts w:ascii="Times New Roman" w:hAnsi="Times New Roman" w:cs="Times New Roman"/>
+          <w:color w:val="000000" w:themeColor="text1"/>
+          <w:sz w:val="28"/>
+          <w:szCs w:val="28"/>
+          <w:lang w:val="vi-VN"/>
         </w:rPr>
         <w:t>Phân loại và Quản lý đặc tính kỹ thuật: Hệ thống theo dõi danh mục xe dựa trên các tiêu chí quan trọng: tải trọng (tấn), kích thước thùng xe, và loại thùng (thùng lạnh, thùng bạt, thùng kín). Việc lưu trữ định mức tiêu hao nhiên liệu cho từng loại xe là căn cứ để hệ thống tính toán chi phí vận hành và lợi nhuận cho mỗi chuyến đi.</w:t>
       </w:r>
@@ -821,14 +829,16 @@
           <w:color w:val="000000" w:themeColor="text1"/>
           <w:sz w:val="28"/>
           <w:szCs w:val="28"/>
-        </w:rPr>
-      </w:pPr>
-      <w:r>
-        <w:rPr>
-          <w:rFonts w:ascii="Times New Roman" w:hAnsi="Times New Roman" w:cs="Times New Roman"/>
-          <w:color w:val="000000" w:themeColor="text1"/>
-          <w:sz w:val="28"/>
-          <w:szCs w:val="28"/>
+          <w:lang w:val="vi-VN"/>
+        </w:rPr>
+      </w:pPr>
+      <w:r>
+        <w:rPr>
+          <w:rFonts w:ascii="Times New Roman" w:hAnsi="Times New Roman" w:cs="Times New Roman"/>
+          <w:color w:val="000000" w:themeColor="text1"/>
+          <w:sz w:val="28"/>
+          <w:szCs w:val="28"/>
+          <w:lang w:val="vi-VN"/>
         </w:rPr>
         <w:t xml:space="preserve">Quản lý trạng thái vận hành thời gian thực: Mỗi phương tiện được gắn một trạng thái cụ thể: </w:t>
       </w:r>
@@ -840,6 +850,7 @@
           <w:color w:val="000000" w:themeColor="text1"/>
           <w:sz w:val="28"/>
           <w:szCs w:val="28"/>
+          <w:lang w:val="vi-VN"/>
         </w:rPr>
         <w:t>Đang chạy</w:t>
       </w:r>
@@ -849,6 +860,7 @@
           <w:color w:val="000000" w:themeColor="text1"/>
           <w:sz w:val="28"/>
           <w:szCs w:val="28"/>
+          <w:lang w:val="vi-VN"/>
         </w:rPr>
         <w:t xml:space="preserve"> (trên lộ trình), </w:t>
       </w:r>
@@ -860,6 +872,7 @@
           <w:color w:val="000000" w:themeColor="text1"/>
           <w:sz w:val="28"/>
           <w:szCs w:val="28"/>
+          <w:lang w:val="vi-VN"/>
         </w:rPr>
         <w:t>Đang trống</w:t>
       </w:r>
@@ -869,6 +882,7 @@
           <w:color w:val="000000" w:themeColor="text1"/>
           <w:sz w:val="28"/>
           <w:szCs w:val="28"/>
+          <w:lang w:val="vi-VN"/>
         </w:rPr>
         <w:t xml:space="preserve"> (sẵn sàng nhận đơn), hoặc </w:t>
       </w:r>
@@ -880,6 +894,7 @@
           <w:color w:val="000000" w:themeColor="text1"/>
           <w:sz w:val="28"/>
           <w:szCs w:val="28"/>
+          <w:lang w:val="vi-VN"/>
         </w:rPr>
         <w:t>Đang sửa chữa</w:t>
       </w:r>
@@ -889,6 +904,7 @@
           <w:color w:val="000000" w:themeColor="text1"/>
           <w:sz w:val="28"/>
           <w:szCs w:val="28"/>
+          <w:lang w:val="vi-VN"/>
         </w:rPr>
         <w:t>. Trạng thái này là tiền kiện để hệ thống điều phối lọc ra những xe khả dụng, tránh việc gán đơn cho xe đang bảo trì.</w:t>
       </w:r>
@@ -906,14 +922,16 @@
           <w:color w:val="000000" w:themeColor="text1"/>
           <w:sz w:val="28"/>
           <w:szCs w:val="28"/>
-        </w:rPr>
-      </w:pPr>
-      <w:r>
-        <w:rPr>
-          <w:rFonts w:ascii="Times New Roman" w:hAnsi="Times New Roman" w:cs="Times New Roman"/>
-          <w:color w:val="000000" w:themeColor="text1"/>
-          <w:sz w:val="28"/>
-          <w:szCs w:val="28"/>
+          <w:lang w:val="vi-VN"/>
+        </w:rPr>
+      </w:pPr>
+      <w:r>
+        <w:rPr>
+          <w:rFonts w:ascii="Times New Roman" w:hAnsi="Times New Roman" w:cs="Times New Roman"/>
+          <w:color w:val="000000" w:themeColor="text1"/>
+          <w:sz w:val="28"/>
+          <w:szCs w:val="28"/>
+          <w:lang w:val="vi-VN"/>
         </w:rPr>
         <w:t>Số hóa hồ sơ phương tiện: Lưu trữ chi tiết lịch sử bảo trì, hồ sơ đăng kiểm và các giấy tờ liên quan. Người dùng có thể xem nhanh các thông tin này khi truy cập chi tiết một mã phương tiện, giúp kiểm soát chất lượng kỹ thuật của đội xe.</w:t>
       </w:r>
@@ -931,14 +949,16 @@
           <w:color w:val="000000" w:themeColor="text1"/>
           <w:sz w:val="28"/>
           <w:szCs w:val="28"/>
-        </w:rPr>
-      </w:pPr>
-      <w:r>
-        <w:rPr>
-          <w:rFonts w:ascii="Times New Roman" w:hAnsi="Times New Roman" w:cs="Times New Roman"/>
-          <w:color w:val="000000" w:themeColor="text1"/>
-          <w:sz w:val="28"/>
-          <w:szCs w:val="28"/>
+          <w:lang w:val="vi-VN"/>
+        </w:rPr>
+      </w:pPr>
+      <w:r>
+        <w:rPr>
+          <w:rFonts w:ascii="Times New Roman" w:hAnsi="Times New Roman" w:cs="Times New Roman"/>
+          <w:color w:val="000000" w:themeColor="text1"/>
+          <w:sz w:val="28"/>
+          <w:szCs w:val="28"/>
+          <w:lang w:val="vi-VN"/>
         </w:rPr>
         <w:t xml:space="preserve">Nghiệp vụ nhập liệu hàng loạt (Bulk Insert): Để tiết kiệm thời gian cho doanh nghiệp có đội xe lớn, hệ thống hỗ trợ nghiệp vụ nhập dữ liệu từ file Excel. Quy trình này bao gồm việc kiểm soát cấu trúc file, xác thực định dạng biển </w:t>
       </w:r>
@@ -948,6 +968,7 @@
           <w:color w:val="000000" w:themeColor="text1"/>
           <w:sz w:val="28"/>
           <w:szCs w:val="28"/>
+          <w:lang w:val="vi-VN"/>
         </w:rPr>
         <w:lastRenderedPageBreak/>
         <w:t>số xe và thông báo chi tiết số lượng bản ghi thành công/thất bại để người dùng kịp thời điều chỉnh.</w:t>
@@ -966,14 +987,16 @@
           <w:color w:val="000000" w:themeColor="text1"/>
           <w:sz w:val="28"/>
           <w:szCs w:val="28"/>
-        </w:rPr>
-      </w:pPr>
-      <w:r>
-        <w:rPr>
-          <w:rFonts w:ascii="Times New Roman" w:hAnsi="Times New Roman" w:cs="Times New Roman"/>
-          <w:color w:val="000000" w:themeColor="text1"/>
-          <w:sz w:val="28"/>
-          <w:szCs w:val="28"/>
+          <w:lang w:val="vi-VN"/>
+        </w:rPr>
+      </w:pPr>
+      <w:r>
+        <w:rPr>
+          <w:rFonts w:ascii="Times New Roman" w:hAnsi="Times New Roman" w:cs="Times New Roman"/>
+          <w:color w:val="000000" w:themeColor="text1"/>
+          <w:sz w:val="28"/>
+          <w:szCs w:val="28"/>
+          <w:lang w:val="vi-VN"/>
         </w:rPr>
         <w:t>Mở rộng danh mục linh hoạt: Trong quá trình thêm mới phương tiện, nếu gặp loại xe chưa có trong hệ thống, người dùng có thể khởi tạo nhanh loại xe mới ngay tại form nhập liệu. Điều này đảm bảo tính liên tục của nghiệp vụ mà không làm gián đoạn quy trình cập nhật hồ sơ.</w:t>
       </w:r>
@@ -988,14 +1011,16 @@
           <w:color w:val="000000" w:themeColor="text1"/>
           <w:sz w:val="28"/>
           <w:szCs w:val="28"/>
-        </w:rPr>
-      </w:pPr>
-      <w:r>
-        <w:rPr>
-          <w:rFonts w:ascii="Times New Roman" w:hAnsi="Times New Roman" w:cs="Times New Roman"/>
-          <w:color w:val="000000" w:themeColor="text1"/>
-          <w:sz w:val="28"/>
-          <w:szCs w:val="28"/>
+          <w:lang w:val="vi-VN"/>
+        </w:rPr>
+      </w:pPr>
+      <w:r>
+        <w:rPr>
+          <w:rFonts w:ascii="Times New Roman" w:hAnsi="Times New Roman" w:cs="Times New Roman"/>
+          <w:color w:val="000000" w:themeColor="text1"/>
+          <w:sz w:val="28"/>
+          <w:szCs w:val="28"/>
+          <w:lang w:val="vi-VN"/>
         </w:rPr>
         <w:t>2</w:t>
       </w:r>
@@ -1006,6 +1031,7 @@
           <w:color w:val="000000" w:themeColor="text1"/>
           <w:sz w:val="28"/>
           <w:szCs w:val="28"/>
+          <w:lang w:val="vi-VN"/>
         </w:rPr>
         <w:t>.2.6. Quản lý kho hàng</w:t>
       </w:r>
@@ -1020,14 +1046,16 @@
           <w:color w:val="000000" w:themeColor="text1"/>
           <w:sz w:val="28"/>
           <w:szCs w:val="28"/>
-        </w:rPr>
-      </w:pPr>
-      <w:r>
-        <w:rPr>
-          <w:rFonts w:ascii="Times New Roman" w:hAnsi="Times New Roman" w:cs="Times New Roman"/>
-          <w:color w:val="000000" w:themeColor="text1"/>
-          <w:sz w:val="28"/>
-          <w:szCs w:val="28"/>
+          <w:lang w:val="vi-VN"/>
+        </w:rPr>
+      </w:pPr>
+      <w:r>
+        <w:rPr>
+          <w:rFonts w:ascii="Times New Roman" w:hAnsi="Times New Roman" w:cs="Times New Roman"/>
+          <w:color w:val="000000" w:themeColor="text1"/>
+          <w:sz w:val="28"/>
+          <w:szCs w:val="28"/>
+          <w:lang w:val="vi-VN"/>
         </w:rPr>
         <w:t>Mô tả tổng quát: Nghiệp vụ này quản lý các hoạt động tại kho trung chuyển (Hub), nơi hàng hóa được tập kết trước khi phân phối đến điểm cuối. Mục tiêu của chức năng là tối ưu hóa không gian lưu trữ và kiểm soát chính xác luồng hàng hóa nhập - xuất thông qua việc số hóa quy trình vận hành.</w:t>
       </w:r>
@@ -1041,14 +1069,16 @@
           <w:color w:val="000000" w:themeColor="text1"/>
           <w:sz w:val="28"/>
           <w:szCs w:val="28"/>
-        </w:rPr>
-      </w:pPr>
-      <w:r>
-        <w:rPr>
-          <w:rFonts w:ascii="Times New Roman" w:hAnsi="Times New Roman" w:cs="Times New Roman"/>
-          <w:color w:val="000000" w:themeColor="text1"/>
-          <w:sz w:val="28"/>
-          <w:szCs w:val="28"/>
+          <w:lang w:val="vi-VN"/>
+        </w:rPr>
+      </w:pPr>
+      <w:r>
+        <w:rPr>
+          <w:rFonts w:ascii="Times New Roman" w:hAnsi="Times New Roman" w:cs="Times New Roman"/>
+          <w:color w:val="000000" w:themeColor="text1"/>
+          <w:sz w:val="28"/>
+          <w:szCs w:val="28"/>
+          <w:lang w:val="vi-VN"/>
         </w:rPr>
         <w:t>Các quy trình nghiệp vụ chi tiết:</w:t>
       </w:r>
@@ -1066,14 +1096,16 @@
           <w:color w:val="000000" w:themeColor="text1"/>
           <w:sz w:val="28"/>
           <w:szCs w:val="28"/>
-        </w:rPr>
-      </w:pPr>
-      <w:r>
-        <w:rPr>
-          <w:rFonts w:ascii="Times New Roman" w:hAnsi="Times New Roman" w:cs="Times New Roman"/>
-          <w:color w:val="000000" w:themeColor="text1"/>
-          <w:sz w:val="28"/>
-          <w:szCs w:val="28"/>
+          <w:lang w:val="vi-VN"/>
+        </w:rPr>
+      </w:pPr>
+      <w:r>
+        <w:rPr>
+          <w:rFonts w:ascii="Times New Roman" w:hAnsi="Times New Roman" w:cs="Times New Roman"/>
+          <w:color w:val="000000" w:themeColor="text1"/>
+          <w:sz w:val="28"/>
+          <w:szCs w:val="28"/>
+          <w:lang w:val="vi-VN"/>
         </w:rPr>
         <w:t>Xử lý luồng hàng Nhập - Xuất kho: Hệ thống ghi nhận mọi biến động hàng hóa khi vào hoặc ra khỏi kho. Quy trình nhập kho bao gồm việc xác nhận từ đơn hàng vận chuyển, thực hiện kiểm kê số lượng thực tế so với chứng từ. Quy trình xuất kho được kích hoạt khi có lệnh điều phối, đảm bảo hàng rời kho đúng thời gian và đúng đơn vị vận chuyển.</w:t>
       </w:r>
@@ -1091,14 +1123,16 @@
           <w:color w:val="000000" w:themeColor="text1"/>
           <w:sz w:val="28"/>
           <w:szCs w:val="28"/>
-        </w:rPr>
-      </w:pPr>
-      <w:r>
-        <w:rPr>
-          <w:rFonts w:ascii="Times New Roman" w:hAnsi="Times New Roman" w:cs="Times New Roman"/>
-          <w:color w:val="000000" w:themeColor="text1"/>
-          <w:sz w:val="28"/>
-          <w:szCs w:val="28"/>
+          <w:lang w:val="vi-VN"/>
+        </w:rPr>
+      </w:pPr>
+      <w:r>
+        <w:rPr>
+          <w:rFonts w:ascii="Times New Roman" w:hAnsi="Times New Roman" w:cs="Times New Roman"/>
+          <w:color w:val="000000" w:themeColor="text1"/>
+          <w:sz w:val="28"/>
+          <w:szCs w:val="28"/>
+          <w:lang w:val="vi-VN"/>
         </w:rPr>
         <w:t>Quản lý vị trí lưu kho và Gom đơn (Consolidation): Hệ thống cho phép phân chia kho thành các khu vực hoặc kệ hàng cụ thể. Nghiệp vụ này hỗ trợ việc "gom đơn": các đơn hàng nhỏ, lẻ cùng hướng tuyến sẽ được tập kết tại một vị trí định trước để thuận tiện cho việc bốc xếp lên cùng một phương tiện, giúp tối ưu hóa tải trọng và giảm chi phí chuyến đi.</w:t>
       </w:r>
@@ -1116,14 +1150,16 @@
           <w:color w:val="000000" w:themeColor="text1"/>
           <w:sz w:val="28"/>
           <w:szCs w:val="28"/>
-        </w:rPr>
-      </w:pPr>
-      <w:r>
-        <w:rPr>
-          <w:rFonts w:ascii="Times New Roman" w:hAnsi="Times New Roman" w:cs="Times New Roman"/>
-          <w:color w:val="000000" w:themeColor="text1"/>
-          <w:sz w:val="28"/>
-          <w:szCs w:val="28"/>
+          <w:lang w:val="vi-VN"/>
+        </w:rPr>
+      </w:pPr>
+      <w:r>
+        <w:rPr>
+          <w:rFonts w:ascii="Times New Roman" w:hAnsi="Times New Roman" w:cs="Times New Roman"/>
+          <w:color w:val="000000" w:themeColor="text1"/>
+          <w:sz w:val="28"/>
+          <w:szCs w:val="28"/>
+          <w:lang w:val="vi-VN"/>
         </w:rPr>
         <w:t>Số hóa bằng mã vận đơn (Barcode/QR Code): Đây là nghiệp vụ then chốt để tăng tốc độ xử lý. Mỗi kiện hàng hoặc pallet khi nhập kho sẽ được hệ thống cấp một mã vận đơn duy nhất. Nhân viên kho thực hiện in và dán mã này để phục vụ việc quét mã (Scan) khi kiểm kê hoặc xuất kho, giúp loại bỏ các sai sót thủ công và đảm bảo tính chính xác 100%.</w:t>
       </w:r>
@@ -1141,14 +1177,16 @@
           <w:color w:val="000000" w:themeColor="text1"/>
           <w:sz w:val="28"/>
           <w:szCs w:val="28"/>
-        </w:rPr>
-      </w:pPr>
-      <w:r>
-        <w:rPr>
-          <w:rFonts w:ascii="Times New Roman" w:hAnsi="Times New Roman" w:cs="Times New Roman"/>
-          <w:color w:val="000000" w:themeColor="text1"/>
-          <w:sz w:val="28"/>
-          <w:szCs w:val="28"/>
+          <w:lang w:val="vi-VN"/>
+        </w:rPr>
+      </w:pPr>
+      <w:r>
+        <w:rPr>
+          <w:rFonts w:ascii="Times New Roman" w:hAnsi="Times New Roman" w:cs="Times New Roman"/>
+          <w:color w:val="000000" w:themeColor="text1"/>
+          <w:sz w:val="28"/>
+          <w:szCs w:val="28"/>
+          <w:lang w:val="vi-VN"/>
         </w:rPr>
         <w:lastRenderedPageBreak/>
         <w:t>Quản lý tồn kho thời gian thực: Hệ thống tự động cập nhật số lượng tồn kho ngay sau mỗi giao dịch nhập/xuất. Nghiệp vụ này cung cấp cái nhìn tổng thể về khả năng chứa của kho tại mỗi thời điểm, giúp bộ phận điều hành biết được kho nào còn trống để hướng dòng hàng về đó.</w:t>
@@ -1164,14 +1202,16 @@
           <w:color w:val="000000" w:themeColor="text1"/>
           <w:sz w:val="28"/>
           <w:szCs w:val="28"/>
-        </w:rPr>
-      </w:pPr>
-      <w:r>
-        <w:rPr>
-          <w:rFonts w:ascii="Times New Roman" w:hAnsi="Times New Roman" w:cs="Times New Roman"/>
-          <w:color w:val="000000" w:themeColor="text1"/>
-          <w:sz w:val="28"/>
-          <w:szCs w:val="28"/>
+          <w:lang w:val="vi-VN"/>
+        </w:rPr>
+      </w:pPr>
+      <w:r>
+        <w:rPr>
+          <w:rFonts w:ascii="Times New Roman" w:hAnsi="Times New Roman" w:cs="Times New Roman"/>
+          <w:color w:val="000000" w:themeColor="text1"/>
+          <w:sz w:val="28"/>
+          <w:szCs w:val="28"/>
+          <w:lang w:val="vi-VN"/>
         </w:rPr>
         <w:t>2.2.7. Giám sát bảo trì và đăng kiểm</w:t>
       </w:r>
@@ -1186,14 +1226,16 @@
           <w:color w:val="000000" w:themeColor="text1"/>
           <w:sz w:val="28"/>
           <w:szCs w:val="28"/>
-        </w:rPr>
-      </w:pPr>
-      <w:r>
-        <w:rPr>
-          <w:rFonts w:ascii="Times New Roman" w:hAnsi="Times New Roman" w:cs="Times New Roman"/>
-          <w:color w:val="000000" w:themeColor="text1"/>
-          <w:sz w:val="28"/>
-          <w:szCs w:val="28"/>
+          <w:lang w:val="vi-VN"/>
+        </w:rPr>
+      </w:pPr>
+      <w:r>
+        <w:rPr>
+          <w:rFonts w:ascii="Times New Roman" w:hAnsi="Times New Roman" w:cs="Times New Roman"/>
+          <w:color w:val="000000" w:themeColor="text1"/>
+          <w:sz w:val="28"/>
+          <w:szCs w:val="28"/>
+          <w:lang w:val="vi-VN"/>
         </w:rPr>
         <w:t>Mô tả tổng quát: Đây là nghiệp vụ quản trị kỹ thuật quan trọng nhằm duy trì tình trạng hoạt động tốt nhất cho đội xe và đảm bảo tuân thủ các quy định pháp luật về an toàn giao thông. Chức năng này giúp chuyển đổi từ việc theo dõi thủ công sang hệ thống cảnh báo chủ động, giảm thiểu rủi ro xe bị hỏng hóc giữa hành trình hoặc bị xử phạt do quá hạn kiểm định.</w:t>
       </w:r>
@@ -1207,14 +1249,16 @@
           <w:color w:val="000000" w:themeColor="text1"/>
           <w:sz w:val="28"/>
           <w:szCs w:val="28"/>
-        </w:rPr>
-      </w:pPr>
-      <w:r>
-        <w:rPr>
-          <w:rFonts w:ascii="Times New Roman" w:hAnsi="Times New Roman" w:cs="Times New Roman"/>
-          <w:color w:val="000000" w:themeColor="text1"/>
-          <w:sz w:val="28"/>
-          <w:szCs w:val="28"/>
+          <w:lang w:val="vi-VN"/>
+        </w:rPr>
+      </w:pPr>
+      <w:r>
+        <w:rPr>
+          <w:rFonts w:ascii="Times New Roman" w:hAnsi="Times New Roman" w:cs="Times New Roman"/>
+          <w:color w:val="000000" w:themeColor="text1"/>
+          <w:sz w:val="28"/>
+          <w:szCs w:val="28"/>
+          <w:lang w:val="vi-VN"/>
         </w:rPr>
         <w:t>Các quy trình nghiệp vụ chi tiết:</w:t>
       </w:r>
@@ -1232,14 +1276,16 @@
           <w:color w:val="000000" w:themeColor="text1"/>
           <w:sz w:val="28"/>
           <w:szCs w:val="28"/>
-        </w:rPr>
-      </w:pPr>
-      <w:r>
-        <w:rPr>
-          <w:rFonts w:ascii="Times New Roman" w:hAnsi="Times New Roman" w:cs="Times New Roman"/>
-          <w:color w:val="000000" w:themeColor="text1"/>
-          <w:sz w:val="28"/>
-          <w:szCs w:val="28"/>
+          <w:lang w:val="vi-VN"/>
+        </w:rPr>
+      </w:pPr>
+      <w:r>
+        <w:rPr>
+          <w:rFonts w:ascii="Times New Roman" w:hAnsi="Times New Roman" w:cs="Times New Roman"/>
+          <w:color w:val="000000" w:themeColor="text1"/>
+          <w:sz w:val="28"/>
+          <w:szCs w:val="28"/>
+          <w:lang w:val="vi-VN"/>
         </w:rPr>
         <w:t>Tự động hóa lịch trình bảo dưỡng: Hệ thống thiết lập định mức bảo trì riêng cho từng loại xe. Logic nghiệp vụ sẽ tự động tính toán dựa trên hai biến số: số Km thực tế xe đã đi (được cập nhật từ mô-đun Theo dõi hành trình) hoặc khoảng thời gian sử dụng. Khi xe đạt đến ngưỡng định mức, hệ thống sẽ tự động đưa xe vào danh sách "Cần bảo trì" để người quản lý chủ động sắp xếp lịch sửa chữa.</w:t>
       </w:r>
@@ -1257,14 +1303,16 @@
           <w:color w:val="000000" w:themeColor="text1"/>
           <w:sz w:val="28"/>
           <w:szCs w:val="28"/>
-        </w:rPr>
-      </w:pPr>
-      <w:r>
-        <w:rPr>
-          <w:rFonts w:ascii="Times New Roman" w:hAnsi="Times New Roman" w:cs="Times New Roman"/>
-          <w:color w:val="000000" w:themeColor="text1"/>
-          <w:sz w:val="28"/>
-          <w:szCs w:val="28"/>
+          <w:lang w:val="vi-VN"/>
+        </w:rPr>
+      </w:pPr>
+      <w:r>
+        <w:rPr>
+          <w:rFonts w:ascii="Times New Roman" w:hAnsi="Times New Roman" w:cs="Times New Roman"/>
+          <w:color w:val="000000" w:themeColor="text1"/>
+          <w:sz w:val="28"/>
+          <w:szCs w:val="28"/>
+          <w:lang w:val="vi-VN"/>
         </w:rPr>
         <w:t>Giám sát thời hạn Đăng kiểm và Bảo hiểm: Hệ thống lưu trữ ngày kiểm định cuối cùng và thời hạn của các loại bảo hiểm bắt buộc. Nghiệp vụ then chốt ở đây là Cảnh báo sớm: Hệ thống sẽ phát tín hiệu cảnh báo trên màn hình quản trị trước từ 15 đến 30 ngày. Điều này giúp bộ phận kỹ thuật có đủ thời gian chuẩn bị hồ sơ và đưa xe đi đăng kiểm mà không làm gián đoạn kế hoạch vận tải.</w:t>
       </w:r>
@@ -1282,14 +1330,16 @@
           <w:color w:val="000000" w:themeColor="text1"/>
           <w:sz w:val="28"/>
           <w:szCs w:val="28"/>
-        </w:rPr>
-      </w:pPr>
-      <w:r>
-        <w:rPr>
-          <w:rFonts w:ascii="Times New Roman" w:hAnsi="Times New Roman" w:cs="Times New Roman"/>
-          <w:color w:val="000000" w:themeColor="text1"/>
-          <w:sz w:val="28"/>
-          <w:szCs w:val="28"/>
+          <w:lang w:val="vi-VN"/>
+        </w:rPr>
+      </w:pPr>
+      <w:r>
+        <w:rPr>
+          <w:rFonts w:ascii="Times New Roman" w:hAnsi="Times New Roman" w:cs="Times New Roman"/>
+          <w:color w:val="000000" w:themeColor="text1"/>
+          <w:sz w:val="28"/>
+          <w:szCs w:val="28"/>
+          <w:lang w:val="vi-VN"/>
         </w:rPr>
         <w:t xml:space="preserve">Quản lý định mức theo loại phương tiện: Người dùng có thể cấu hình các thông số kỹ thuật bảo trì khác nhau (ví dụ: xe tải nặng cần thay dầu sau mỗi 5.000km, xe tải nhẹ là 10.000km). Nếu một xe chưa được cấu hình định mức, </w:t>
       </w:r>
@@ -1299,6 +1349,7 @@
           <w:color w:val="000000" w:themeColor="text1"/>
           <w:sz w:val="28"/>
           <w:szCs w:val="28"/>
+          <w:lang w:val="vi-VN"/>
         </w:rPr>
         <w:lastRenderedPageBreak/>
         <w:t>hệ thống sẽ yêu cầu thiết lập bổ sung để đảm bảo mọi phương tiện đều nằm trong vòng kiểm soát an toàn.</w:t>
@@ -1317,14 +1368,16 @@
           <w:color w:val="000000" w:themeColor="text1"/>
           <w:sz w:val="28"/>
           <w:szCs w:val="28"/>
-        </w:rPr>
-      </w:pPr>
-      <w:r>
-        <w:rPr>
-          <w:rFonts w:ascii="Times New Roman" w:hAnsi="Times New Roman" w:cs="Times New Roman"/>
-          <w:color w:val="000000" w:themeColor="text1"/>
-          <w:sz w:val="28"/>
-          <w:szCs w:val="28"/>
+          <w:lang w:val="vi-VN"/>
+        </w:rPr>
+      </w:pPr>
+      <w:r>
+        <w:rPr>
+          <w:rFonts w:ascii="Times New Roman" w:hAnsi="Times New Roman" w:cs="Times New Roman"/>
+          <w:color w:val="000000" w:themeColor="text1"/>
+          <w:sz w:val="28"/>
+          <w:szCs w:val="28"/>
+          <w:lang w:val="vi-VN"/>
         </w:rPr>
         <w:t>Nghiệp vụ Nhập/Xuất dữ liệu và Báo cáo chuyên sâu:</w:t>
       </w:r>
@@ -1342,14 +1395,16 @@
           <w:color w:val="000000" w:themeColor="text1"/>
           <w:sz w:val="28"/>
           <w:szCs w:val="28"/>
-        </w:rPr>
-      </w:pPr>
-      <w:r>
-        <w:rPr>
-          <w:rFonts w:ascii="Times New Roman" w:hAnsi="Times New Roman" w:cs="Times New Roman"/>
-          <w:color w:val="000000" w:themeColor="text1"/>
-          <w:sz w:val="28"/>
-          <w:szCs w:val="28"/>
+          <w:lang w:val="vi-VN"/>
+        </w:rPr>
+      </w:pPr>
+      <w:r>
+        <w:rPr>
+          <w:rFonts w:ascii="Times New Roman" w:hAnsi="Times New Roman" w:cs="Times New Roman"/>
+          <w:color w:val="000000" w:themeColor="text1"/>
+          <w:sz w:val="28"/>
+          <w:szCs w:val="28"/>
+          <w:lang w:val="vi-VN"/>
         </w:rPr>
         <w:t>Nhập liệu hàng loạt: Hỗ trợ nhập lịch sử bảo trì từ file Excel để nhanh chóng cập nhật dữ liệu cho đội xe lớn.</w:t>
       </w:r>
@@ -1367,14 +1422,16 @@
           <w:color w:val="000000" w:themeColor="text1"/>
           <w:sz w:val="28"/>
           <w:szCs w:val="28"/>
-        </w:rPr>
-      </w:pPr>
-      <w:r>
-        <w:rPr>
-          <w:rFonts w:ascii="Times New Roman" w:hAnsi="Times New Roman" w:cs="Times New Roman"/>
-          <w:color w:val="000000" w:themeColor="text1"/>
-          <w:sz w:val="28"/>
-          <w:szCs w:val="28"/>
+          <w:lang w:val="vi-VN"/>
+        </w:rPr>
+      </w:pPr>
+      <w:r>
+        <w:rPr>
+          <w:rFonts w:ascii="Times New Roman" w:hAnsi="Times New Roman" w:cs="Times New Roman"/>
+          <w:color w:val="000000" w:themeColor="text1"/>
+          <w:sz w:val="28"/>
+          <w:szCs w:val="28"/>
+          <w:lang w:val="vi-VN"/>
         </w:rPr>
         <w:t>Xuất báo cáo tùy chỉnh: Cho phép người dùng kết xuất các loại báo cáo chuyên biệt (Excel) về Bảo trì, Đăng kiểm, hoặc Phí đường bộ. Các báo cáo này là căn cứ để Kế toán vận hành phê duyệt chi phí và quản lý dự toán ngân sách kỹ thuật hàng năm.</w:t>
       </w:r>
@@ -1392,14 +1449,16 @@
           <w:color w:val="000000" w:themeColor="text1"/>
           <w:sz w:val="28"/>
           <w:szCs w:val="28"/>
-        </w:rPr>
-      </w:pPr>
-      <w:r>
-        <w:rPr>
-          <w:rFonts w:ascii="Times New Roman" w:hAnsi="Times New Roman" w:cs="Times New Roman"/>
-          <w:color w:val="000000" w:themeColor="text1"/>
-          <w:sz w:val="28"/>
-          <w:szCs w:val="28"/>
+          <w:lang w:val="vi-VN"/>
+        </w:rPr>
+      </w:pPr>
+      <w:r>
+        <w:rPr>
+          <w:rFonts w:ascii="Times New Roman" w:hAnsi="Times New Roman" w:cs="Times New Roman"/>
+          <w:color w:val="000000" w:themeColor="text1"/>
+          <w:sz w:val="28"/>
+          <w:szCs w:val="28"/>
+          <w:lang w:val="vi-VN"/>
         </w:rPr>
         <w:t>Đồng bộ hóa dữ liệu thời gian thực: Để đảm bảo tính chính xác, mỗi khi có sự thay đổi về số Km hoặc thông tin phương tiện từ các mô-đun khác, hệ thống sẽ thực hiện làm mới dữ liệu (refresh cache). Điều này đảm bảo danh sách cảnh báo luôn phản ánh đúng tình trạng thực tế của đội xe tại thời điểm truy cập.</w:t>
       </w:r>
@@ -3048,6 +3107,327 @@
           <w:color w:val="000000" w:themeColor="text1"/>
           <w:sz w:val="28"/>
           <w:szCs w:val="28"/>
+          <w:lang w:val="vi-VN"/>
+        </w:rPr>
+      </w:pPr>
+    </w:p>
+    <w:p>
+      <w:pPr>
+        <w:pStyle w:val="Heading2"/>
+        <w:rPr>
+          <w:rFonts w:ascii="Times New Roman" w:hAnsi="Times New Roman" w:cs="Times New Roman"/>
+          <w:b/>
+          <w:bCs/>
+          <w:color w:val="000000" w:themeColor="text1"/>
+          <w:lang w:val="vi-VN"/>
+        </w:rPr>
+      </w:pPr>
+      <w:r>
+        <w:rPr>
+          <w:rFonts w:ascii="Times New Roman" w:hAnsi="Times New Roman" w:cs="Times New Roman"/>
+          <w:b/>
+          <w:bCs/>
+          <w:color w:val="000000" w:themeColor="text1"/>
+          <w:lang w:val="vi-VN"/>
+        </w:rPr>
+        <w:lastRenderedPageBreak/>
+        <w:t>2.2.16 Nhật ký hệ thống</w:t>
+      </w:r>
+    </w:p>
+    <w:p>
+      <w:pPr>
+        <w:spacing w:after="0" w:line="360" w:lineRule="auto"/>
+        <w:ind w:firstLine="720"/>
+        <w:jc w:val="both"/>
+        <w:rPr>
+          <w:rFonts w:ascii="Times New Roman" w:hAnsi="Times New Roman" w:cs="Times New Roman"/>
+          <w:color w:val="000000" w:themeColor="text1"/>
+          <w:sz w:val="28"/>
+          <w:szCs w:val="28"/>
+          <w:lang w:val="vi-VN"/>
+        </w:rPr>
+      </w:pPr>
+      <w:r>
+        <w:rPr>
+          <w:rFonts w:ascii="Times New Roman" w:hAnsi="Times New Roman" w:cs="Times New Roman"/>
+          <w:color w:val="000000" w:themeColor="text1"/>
+          <w:sz w:val="28"/>
+          <w:szCs w:val="28"/>
+          <w:lang w:val="vi-VN"/>
+        </w:rPr>
+        <w:t>Mô tả tổng quát: Nghiệp vụ Nhật ký hệ thống đóng vai trò là "hộp đen" lưu trữ toàn bộ tiến trình hoạt động của con người và biến động dữ liệu trong hệ thống TMS. Chức năng này ghi lại chi tiết "Ai đã làm gì, vào lúc nào, ở đâu và dữ liệu thay đổi như thế nào". Đây là công cụ bắt buộc để phục vụ công tác hậu kiểm (Audit), xử lý tranh chấp dữ liệu và phát hiện các hành vi xâm nhập hoặc thao tác sai trái của người dùng.</w:t>
+      </w:r>
+    </w:p>
+    <w:p>
+      <w:pPr>
+        <w:spacing w:after="0" w:line="360" w:lineRule="auto"/>
+        <w:jc w:val="both"/>
+        <w:rPr>
+          <w:rFonts w:ascii="Times New Roman" w:hAnsi="Times New Roman" w:cs="Times New Roman"/>
+          <w:color w:val="000000" w:themeColor="text1"/>
+          <w:sz w:val="28"/>
+          <w:szCs w:val="28"/>
+          <w:lang w:val="vi-VN"/>
+        </w:rPr>
+      </w:pPr>
+      <w:r>
+        <w:rPr>
+          <w:rFonts w:ascii="Times New Roman" w:hAnsi="Times New Roman" w:cs="Times New Roman"/>
+          <w:color w:val="000000" w:themeColor="text1"/>
+          <w:sz w:val="28"/>
+          <w:szCs w:val="28"/>
+          <w:lang w:val="vi-VN"/>
+        </w:rPr>
+        <w:t>Các quy trình nghiệp vụ chi tiết:</w:t>
+      </w:r>
+    </w:p>
+    <w:p>
+      <w:pPr>
+        <w:pStyle w:val="ListParagraph"/>
+        <w:numPr>
+          <w:ilvl w:val="0"/>
+          <w:numId w:val="29"/>
+        </w:numPr>
+        <w:spacing w:after="0" w:line="360" w:lineRule="auto"/>
+        <w:jc w:val="both"/>
+        <w:rPr>
+          <w:color w:val="000000" w:themeColor="text1"/>
+          <w:sz w:val="28"/>
+          <w:szCs w:val="28"/>
+          <w:lang w:val="vi-VN"/>
+        </w:rPr>
+      </w:pPr>
+      <w:r>
+        <w:rPr>
+          <w:rFonts w:ascii="Times New Roman" w:hAnsi="Times New Roman" w:cs="Times New Roman"/>
+          <w:color w:val="000000" w:themeColor="text1"/>
+          <w:sz w:val="28"/>
+          <w:szCs w:val="28"/>
+          <w:lang w:val="vi-VN"/>
+        </w:rPr>
+        <w:t>Ghi nhận vết cắt dữ liệu (Data Snapshotting): Đây là nghiệp vụ quan trọng nhất để đối soát. Khi một bản ghi bị thay đổi (Ví dụ: Sửa giá cước, đổi trạng thái xe), hệ thống không chỉ ghi lại hành động "Sửa" mà phải lưu trữ đồng thời hai trạng thái: Dữ liệu cũ (Before) và Dữ liệu mới (After). Việc lưu trữ dưới dạng cấu trúc JSON giúp người quản lý có thể so sánh chính xác từng trường thông tin đã bị tác động, đảm bảo tính nguyên vẹn và minh bạch của dữ liệu tài chính và vận hành.</w:t>
+      </w:r>
+    </w:p>
+    <w:p>
+      <w:pPr>
+        <w:pStyle w:val="ListParagraph"/>
+        <w:numPr>
+          <w:ilvl w:val="0"/>
+          <w:numId w:val="29"/>
+        </w:numPr>
+        <w:spacing w:after="0" w:line="360" w:lineRule="auto"/>
+        <w:jc w:val="both"/>
+        <w:rPr>
+          <w:color w:val="000000" w:themeColor="text1"/>
+          <w:sz w:val="28"/>
+          <w:szCs w:val="28"/>
+          <w:lang w:val="vi-VN"/>
+        </w:rPr>
+      </w:pPr>
+      <w:r>
+        <w:rPr>
+          <w:rFonts w:ascii="Times New Roman" w:hAnsi="Times New Roman" w:cs="Times New Roman"/>
+          <w:color w:val="000000" w:themeColor="text1"/>
+          <w:sz w:val="28"/>
+          <w:szCs w:val="28"/>
+          <w:lang w:val="vi-VN"/>
+        </w:rPr>
+        <w:t xml:space="preserve"> </w:t>
+      </w:r>
+      <w:r>
+        <w:rPr>
+          <w:color w:val="000000" w:themeColor="text1"/>
+          <w:sz w:val="28"/>
+          <w:szCs w:val="28"/>
+          <w:lang w:val="vi-VN"/>
+        </w:rPr>
+        <w:t>Định danh và Truy vết nguồn gốc thao tác: Mỗi dòng nhật ký được hệ thống tự động gắn chặt với các thông tin định danh không thể thay đổi:</w:t>
+      </w:r>
+    </w:p>
+    <w:p>
+      <w:pPr>
+        <w:pStyle w:val="ListParagraph"/>
+        <w:numPr>
+          <w:ilvl w:val="1"/>
+          <w:numId w:val="37"/>
+        </w:numPr>
+        <w:spacing w:after="0" w:line="360" w:lineRule="auto"/>
+        <w:jc w:val="both"/>
+        <w:rPr>
+          <w:rFonts w:ascii="Times New Roman" w:hAnsi="Times New Roman" w:cs="Times New Roman"/>
+          <w:color w:val="000000" w:themeColor="text1"/>
+          <w:sz w:val="28"/>
+          <w:szCs w:val="28"/>
+          <w:lang w:val="vi-VN"/>
+        </w:rPr>
+      </w:pPr>
+      <w:r>
+        <w:rPr>
+          <w:rFonts w:ascii="Times New Roman" w:hAnsi="Times New Roman" w:cs="Times New Roman"/>
+          <w:color w:val="000000" w:themeColor="text1"/>
+          <w:sz w:val="28"/>
+          <w:szCs w:val="28"/>
+          <w:lang w:val="vi-VN"/>
+        </w:rPr>
+        <w:t>Tài khoản thực hiện: ID và Họ tên nhân sự.</w:t>
+      </w:r>
+    </w:p>
+    <w:p>
+      <w:pPr>
+        <w:pStyle w:val="ListParagraph"/>
+        <w:numPr>
+          <w:ilvl w:val="1"/>
+          <w:numId w:val="37"/>
+        </w:numPr>
+        <w:spacing w:after="0" w:line="360" w:lineRule="auto"/>
+        <w:jc w:val="both"/>
+        <w:rPr>
+          <w:rFonts w:ascii="Times New Roman" w:hAnsi="Times New Roman" w:cs="Times New Roman"/>
+          <w:color w:val="000000" w:themeColor="text1"/>
+          <w:sz w:val="28"/>
+          <w:szCs w:val="28"/>
+          <w:lang w:val="vi-VN"/>
+        </w:rPr>
+      </w:pPr>
+      <w:r>
+        <w:rPr>
+          <w:rFonts w:ascii="Times New Roman" w:hAnsi="Times New Roman" w:cs="Times New Roman"/>
+          <w:color w:val="000000" w:themeColor="text1"/>
+          <w:sz w:val="28"/>
+          <w:szCs w:val="28"/>
+          <w:lang w:val="vi-VN"/>
+        </w:rPr>
+        <w:t>Thời gian thực thi: Ghi nhận chính xác đến mili giây theo giờ hệ thống.</w:t>
+      </w:r>
+    </w:p>
+    <w:p>
+      <w:pPr>
+        <w:pStyle w:val="ListParagraph"/>
+        <w:numPr>
+          <w:ilvl w:val="1"/>
+          <w:numId w:val="37"/>
+        </w:numPr>
+        <w:spacing w:after="0" w:line="360" w:lineRule="auto"/>
+        <w:jc w:val="both"/>
+        <w:rPr>
+          <w:rFonts w:ascii="Times New Roman" w:hAnsi="Times New Roman" w:cs="Times New Roman"/>
+          <w:color w:val="000000" w:themeColor="text1"/>
+          <w:sz w:val="28"/>
+          <w:szCs w:val="28"/>
+          <w:lang w:val="vi-VN"/>
+        </w:rPr>
+      </w:pPr>
+      <w:r>
+        <w:rPr>
+          <w:rFonts w:ascii="Times New Roman" w:hAnsi="Times New Roman" w:cs="Times New Roman"/>
+          <w:color w:val="000000" w:themeColor="text1"/>
+          <w:sz w:val="28"/>
+          <w:szCs w:val="28"/>
+          <w:lang w:val="vi-VN"/>
+        </w:rPr>
+        <w:t>Chức năng tác động: Xác định thao tác đó thuộc module nào (Kho, Điều phối hay Kế toán).</w:t>
+      </w:r>
+    </w:p>
+    <w:p>
+      <w:pPr>
+        <w:pStyle w:val="ListParagraph"/>
+        <w:numPr>
+          <w:ilvl w:val="0"/>
+          <w:numId w:val="37"/>
+        </w:numPr>
+        <w:spacing w:after="0" w:line="360" w:lineRule="auto"/>
+        <w:jc w:val="both"/>
+        <w:rPr>
+          <w:rFonts w:ascii="Times New Roman" w:hAnsi="Times New Roman" w:cs="Times New Roman"/>
+          <w:color w:val="000000" w:themeColor="text1"/>
+          <w:sz w:val="28"/>
+          <w:szCs w:val="28"/>
+          <w:lang w:val="vi-VN"/>
+        </w:rPr>
+      </w:pPr>
+      <w:r>
+        <w:rPr>
+          <w:rFonts w:ascii="Times New Roman" w:hAnsi="Times New Roman" w:cs="Times New Roman"/>
+          <w:color w:val="000000" w:themeColor="text1"/>
+          <w:sz w:val="28"/>
+          <w:szCs w:val="28"/>
+          <w:lang w:val="vi-VN"/>
+        </w:rPr>
+        <w:t xml:space="preserve">Bảo mật và Tính bất biến của nhật </w:t>
+      </w:r>
+      <w:r>
+        <w:rPr>
+          <w:rFonts w:ascii="Times New Roman" w:hAnsi="Times New Roman" w:cs="Times New Roman"/>
+          <w:color w:val="000000" w:themeColor="text1"/>
+          <w:sz w:val="28"/>
+          <w:szCs w:val="28"/>
+          <w:lang w:val="vi-VN"/>
+        </w:rPr>
+        <w:t xml:space="preserve">ký: </w:t>
+      </w:r>
+      <w:r>
+        <w:rPr>
+          <w:rFonts w:ascii="Times New Roman" w:hAnsi="Times New Roman" w:cs="Times New Roman"/>
+          <w:color w:val="000000" w:themeColor="text1"/>
+          <w:sz w:val="28"/>
+          <w:szCs w:val="28"/>
+          <w:lang w:val="vi-VN"/>
+        </w:rPr>
+        <w:t>Giám sát đăng nhập và Bảo mật tài khoản: Hệ thống ghi lại lịch sử mọi lần đăng nhập thành công và thất bại. Nếu một tài khoản có nhiều lần đăng nhập sai liên tiếp từ các địa chỉ IP lạ, nghiệp vụ Nhật ký sẽ kích hoạt lệnh khóa tài khoản tạm thời và gửi thông báo bảo mật đến quản trị viên để ngăn chặn hành vi tấn công dò mật khẩu (Brute-force).</w:t>
+      </w:r>
+    </w:p>
+    <w:p>
+      <w:pPr>
+        <w:pStyle w:val="ListParagraph"/>
+        <w:numPr>
+          <w:ilvl w:val="0"/>
+          <w:numId w:val="37"/>
+        </w:numPr>
+        <w:spacing w:after="0" w:line="360" w:lineRule="auto"/>
+        <w:jc w:val="both"/>
+        <w:rPr>
+          <w:rFonts w:ascii="Times New Roman" w:hAnsi="Times New Roman" w:cs="Times New Roman"/>
+          <w:color w:val="000000" w:themeColor="text1"/>
+          <w:sz w:val="28"/>
+          <w:szCs w:val="28"/>
+          <w:lang w:val="vi-VN"/>
+        </w:rPr>
+      </w:pPr>
+      <w:r>
+        <w:rPr>
+          <w:rFonts w:ascii="Times New Roman" w:hAnsi="Times New Roman" w:cs="Times New Roman"/>
+          <w:color w:val="000000" w:themeColor="text1"/>
+          <w:sz w:val="28"/>
+          <w:szCs w:val="28"/>
+          <w:lang w:val="vi-VN"/>
+        </w:rPr>
+        <w:lastRenderedPageBreak/>
+        <w:t>Nghiệp vụ Nhật ký hệ thống tuân thủ nguyên tắc "Chỉ ghi, không sửa, không xóa". Ngay cả quản trị viên cao cấp (Super Admin) cũng không có quyền chỉnh sửa nội dung nhật ký đã lưu. Các bản ghi cũ sau một khoảng thời gian nhất định (ví dụ 6 tháng hoặc 1 năm) sẽ được hệ thống tự động nén và chuyển vào kho lưu trữ lâu dài (Archive) để tối ưu hiệu suất cho cơ sở dữ liệu vận hành.</w:t>
+      </w:r>
+    </w:p>
+    <w:p>
+      <w:pPr>
+        <w:spacing w:after="0" w:line="360" w:lineRule="auto"/>
+        <w:jc w:val="both"/>
+        <w:rPr>
+          <w:rFonts w:ascii="Times New Roman" w:hAnsi="Times New Roman" w:cs="Times New Roman"/>
+          <w:color w:val="000000" w:themeColor="text1"/>
+          <w:sz w:val="28"/>
+          <w:szCs w:val="28"/>
+          <w:lang w:val="vi-VN"/>
+        </w:rPr>
+      </w:pPr>
+    </w:p>
+    <w:p>
+      <w:pPr>
+        <w:spacing w:after="0" w:line="360" w:lineRule="auto"/>
+        <w:jc w:val="both"/>
+        <w:rPr>
+          <w:rFonts w:ascii="Times New Roman" w:hAnsi="Times New Roman" w:cs="Times New Roman"/>
+          <w:color w:val="000000" w:themeColor="text1"/>
+          <w:sz w:val="28"/>
+          <w:szCs w:val="28"/>
+          <w:lang w:val="vi-VN"/>
         </w:rPr>
       </w:pPr>
     </w:p>
@@ -3588,6 +3968,155 @@
     </w:lvl>
   </w:abstractNum>
   <w:abstractNum w:abstractNumId="3" w15:restartNumberingAfterBreak="0">
+    <w:nsid w:val="09FC49D3"/>
+    <w:multiLevelType w:val="multilevel"/>
+    <w:tmpl w:val="B13E2C1A"/>
+    <w:lvl w:ilvl="0">
+      <w:start w:val="1"/>
+      <w:numFmt w:val="bullet"/>
+      <w:lvlText w:val=""/>
+      <w:lvlJc w:val="left"/>
+      <w:pPr>
+        <w:tabs>
+          <w:tab w:val="num" w:pos="720"/>
+        </w:tabs>
+        <w:ind w:left="720" w:hanging="360"/>
+      </w:pPr>
+      <w:rPr>
+        <w:rFonts w:ascii="Symbol" w:hAnsi="Symbol" w:hint="default"/>
+        <w:sz w:val="20"/>
+      </w:rPr>
+    </w:lvl>
+    <w:lvl w:ilvl="1" w:tentative="1">
+      <w:start w:val="1"/>
+      <w:numFmt w:val="bullet"/>
+      <w:lvlText w:val="o"/>
+      <w:lvlJc w:val="left"/>
+      <w:pPr>
+        <w:tabs>
+          <w:tab w:val="num" w:pos="1440"/>
+        </w:tabs>
+        <w:ind w:left="1440" w:hanging="360"/>
+      </w:pPr>
+      <w:rPr>
+        <w:rFonts w:ascii="Courier New" w:hAnsi="Courier New" w:hint="default"/>
+        <w:sz w:val="20"/>
+      </w:rPr>
+    </w:lvl>
+    <w:lvl w:ilvl="2" w:tentative="1">
+      <w:start w:val="1"/>
+      <w:numFmt w:val="bullet"/>
+      <w:lvlText w:val=""/>
+      <w:lvlJc w:val="left"/>
+      <w:pPr>
+        <w:tabs>
+          <w:tab w:val="num" w:pos="2160"/>
+        </w:tabs>
+        <w:ind w:left="2160" w:hanging="360"/>
+      </w:pPr>
+      <w:rPr>
+        <w:rFonts w:ascii="Wingdings" w:hAnsi="Wingdings" w:hint="default"/>
+        <w:sz w:val="20"/>
+      </w:rPr>
+    </w:lvl>
+    <w:lvl w:ilvl="3" w:tentative="1">
+      <w:start w:val="1"/>
+      <w:numFmt w:val="bullet"/>
+      <w:lvlText w:val=""/>
+      <w:lvlJc w:val="left"/>
+      <w:pPr>
+        <w:tabs>
+          <w:tab w:val="num" w:pos="2880"/>
+        </w:tabs>
+        <w:ind w:left="2880" w:hanging="360"/>
+      </w:pPr>
+      <w:rPr>
+        <w:rFonts w:ascii="Wingdings" w:hAnsi="Wingdings" w:hint="default"/>
+        <w:sz w:val="20"/>
+      </w:rPr>
+    </w:lvl>
+    <w:lvl w:ilvl="4" w:tentative="1">
+      <w:start w:val="1"/>
+      <w:numFmt w:val="bullet"/>
+      <w:lvlText w:val=""/>
+      <w:lvlJc w:val="left"/>
+      <w:pPr>
+        <w:tabs>
+          <w:tab w:val="num" w:pos="3600"/>
+        </w:tabs>
+        <w:ind w:left="3600" w:hanging="360"/>
+      </w:pPr>
+      <w:rPr>
+        <w:rFonts w:ascii="Wingdings" w:hAnsi="Wingdings" w:hint="default"/>
+        <w:sz w:val="20"/>
+      </w:rPr>
+    </w:lvl>
+    <w:lvl w:ilvl="5" w:tentative="1">
+      <w:start w:val="1"/>
+      <w:numFmt w:val="bullet"/>
+      <w:lvlText w:val=""/>
+      <w:lvlJc w:val="left"/>
+      <w:pPr>
+        <w:tabs>
+          <w:tab w:val="num" w:pos="4320"/>
+        </w:tabs>
+        <w:ind w:left="4320" w:hanging="360"/>
+      </w:pPr>
+      <w:rPr>
+        <w:rFonts w:ascii="Wingdings" w:hAnsi="Wingdings" w:hint="default"/>
+        <w:sz w:val="20"/>
+      </w:rPr>
+    </w:lvl>
+    <w:lvl w:ilvl="6" w:tentative="1">
+      <w:start w:val="1"/>
+      <w:numFmt w:val="bullet"/>
+      <w:lvlText w:val=""/>
+      <w:lvlJc w:val="left"/>
+      <w:pPr>
+        <w:tabs>
+          <w:tab w:val="num" w:pos="5040"/>
+        </w:tabs>
+        <w:ind w:left="5040" w:hanging="360"/>
+      </w:pPr>
+      <w:rPr>
+        <w:rFonts w:ascii="Wingdings" w:hAnsi="Wingdings" w:hint="default"/>
+        <w:sz w:val="20"/>
+      </w:rPr>
+    </w:lvl>
+    <w:lvl w:ilvl="7" w:tentative="1">
+      <w:start w:val="1"/>
+      <w:numFmt w:val="bullet"/>
+      <w:lvlText w:val=""/>
+      <w:lvlJc w:val="left"/>
+      <w:pPr>
+        <w:tabs>
+          <w:tab w:val="num" w:pos="5760"/>
+        </w:tabs>
+        <w:ind w:left="5760" w:hanging="360"/>
+      </w:pPr>
+      <w:rPr>
+        <w:rFonts w:ascii="Wingdings" w:hAnsi="Wingdings" w:hint="default"/>
+        <w:sz w:val="20"/>
+      </w:rPr>
+    </w:lvl>
+    <w:lvl w:ilvl="8" w:tentative="1">
+      <w:start w:val="1"/>
+      <w:numFmt w:val="bullet"/>
+      <w:lvlText w:val=""/>
+      <w:lvlJc w:val="left"/>
+      <w:pPr>
+        <w:tabs>
+          <w:tab w:val="num" w:pos="6480"/>
+        </w:tabs>
+        <w:ind w:left="6480" w:hanging="360"/>
+      </w:pPr>
+      <w:rPr>
+        <w:rFonts w:ascii="Wingdings" w:hAnsi="Wingdings" w:hint="default"/>
+        <w:sz w:val="20"/>
+      </w:rPr>
+    </w:lvl>
+  </w:abstractNum>
+  <w:abstractNum w:abstractNumId="4" w15:restartNumberingAfterBreak="0">
     <w:nsid w:val="0CC51FA9"/>
     <w:multiLevelType w:val="hybridMultilevel"/>
     <w:tmpl w:val="DB82C2CE"/>
@@ -3698,7 +4227,118 @@
       </w:rPr>
     </w:lvl>
   </w:abstractNum>
-  <w:abstractNum w:abstractNumId="4" w15:restartNumberingAfterBreak="0">
+  <w:abstractNum w:abstractNumId="5" w15:restartNumberingAfterBreak="0">
+    <w:nsid w:val="10DA3BAD"/>
+    <w:multiLevelType w:val="hybridMultilevel"/>
+    <w:tmpl w:val="CDCA4EE8"/>
+    <w:lvl w:ilvl="0" w:tplc="FFFFFFFF">
+      <w:numFmt w:val="bullet"/>
+      <w:lvlText w:val="-"/>
+      <w:lvlJc w:val="left"/>
+      <w:pPr>
+        <w:ind w:left="720" w:hanging="360"/>
+      </w:pPr>
+      <w:rPr>
+        <w:rFonts w:ascii="Times New Roman" w:eastAsia="Times New Roman" w:hAnsi="Times New Roman" w:cs="Times New Roman" w:hint="default"/>
+      </w:rPr>
+    </w:lvl>
+    <w:lvl w:ilvl="1" w:tplc="14C2DB2E">
+      <w:numFmt w:val="bullet"/>
+      <w:lvlText w:val="+"/>
+      <w:lvlJc w:val="left"/>
+      <w:pPr>
+        <w:ind w:left="1440" w:hanging="360"/>
+      </w:pPr>
+      <w:rPr>
+        <w:rFonts w:ascii="Times New Roman" w:eastAsia="Times New Roman" w:hAnsi="Times New Roman" w:cs="Times New Roman" w:hint="default"/>
+      </w:rPr>
+    </w:lvl>
+    <w:lvl w:ilvl="2" w:tplc="FFFFFFFF" w:tentative="1">
+      <w:start w:val="1"/>
+      <w:numFmt w:val="bullet"/>
+      <w:lvlText w:val=""/>
+      <w:lvlJc w:val="left"/>
+      <w:pPr>
+        <w:ind w:left="2160" w:hanging="360"/>
+      </w:pPr>
+      <w:rPr>
+        <w:rFonts w:ascii="Wingdings" w:hAnsi="Wingdings" w:hint="default"/>
+      </w:rPr>
+    </w:lvl>
+    <w:lvl w:ilvl="3" w:tplc="FFFFFFFF" w:tentative="1">
+      <w:start w:val="1"/>
+      <w:numFmt w:val="bullet"/>
+      <w:lvlText w:val=""/>
+      <w:lvlJc w:val="left"/>
+      <w:pPr>
+        <w:ind w:left="2880" w:hanging="360"/>
+      </w:pPr>
+      <w:rPr>
+        <w:rFonts w:ascii="Symbol" w:hAnsi="Symbol" w:hint="default"/>
+      </w:rPr>
+    </w:lvl>
+    <w:lvl w:ilvl="4" w:tplc="FFFFFFFF" w:tentative="1">
+      <w:start w:val="1"/>
+      <w:numFmt w:val="bullet"/>
+      <w:lvlText w:val="o"/>
+      <w:lvlJc w:val="left"/>
+      <w:pPr>
+        <w:ind w:left="3600" w:hanging="360"/>
+      </w:pPr>
+      <w:rPr>
+        <w:rFonts w:ascii="Courier New" w:hAnsi="Courier New" w:cs="Courier New" w:hint="default"/>
+      </w:rPr>
+    </w:lvl>
+    <w:lvl w:ilvl="5" w:tplc="FFFFFFFF" w:tentative="1">
+      <w:start w:val="1"/>
+      <w:numFmt w:val="bullet"/>
+      <w:lvlText w:val=""/>
+      <w:lvlJc w:val="left"/>
+      <w:pPr>
+        <w:ind w:left="4320" w:hanging="360"/>
+      </w:pPr>
+      <w:rPr>
+        <w:rFonts w:ascii="Wingdings" w:hAnsi="Wingdings" w:hint="default"/>
+      </w:rPr>
+    </w:lvl>
+    <w:lvl w:ilvl="6" w:tplc="FFFFFFFF" w:tentative="1">
+      <w:start w:val="1"/>
+      <w:numFmt w:val="bullet"/>
+      <w:lvlText w:val=""/>
+      <w:lvlJc w:val="left"/>
+      <w:pPr>
+        <w:ind w:left="5040" w:hanging="360"/>
+      </w:pPr>
+      <w:rPr>
+        <w:rFonts w:ascii="Symbol" w:hAnsi="Symbol" w:hint="default"/>
+      </w:rPr>
+    </w:lvl>
+    <w:lvl w:ilvl="7" w:tplc="FFFFFFFF" w:tentative="1">
+      <w:start w:val="1"/>
+      <w:numFmt w:val="bullet"/>
+      <w:lvlText w:val="o"/>
+      <w:lvlJc w:val="left"/>
+      <w:pPr>
+        <w:ind w:left="5760" w:hanging="360"/>
+      </w:pPr>
+      <w:rPr>
+        <w:rFonts w:ascii="Courier New" w:hAnsi="Courier New" w:cs="Courier New" w:hint="default"/>
+      </w:rPr>
+    </w:lvl>
+    <w:lvl w:ilvl="8" w:tplc="FFFFFFFF" w:tentative="1">
+      <w:start w:val="1"/>
+      <w:numFmt w:val="bullet"/>
+      <w:lvlText w:val=""/>
+      <w:lvlJc w:val="left"/>
+      <w:pPr>
+        <w:ind w:left="6480" w:hanging="360"/>
+      </w:pPr>
+      <w:rPr>
+        <w:rFonts w:ascii="Wingdings" w:hAnsi="Wingdings" w:hint="default"/>
+      </w:rPr>
+    </w:lvl>
+  </w:abstractNum>
+  <w:abstractNum w:abstractNumId="6" w15:restartNumberingAfterBreak="0">
     <w:nsid w:val="13A00916"/>
     <w:multiLevelType w:val="multilevel"/>
     <w:tmpl w:val="515206AE"/>
@@ -3846,7 +4486,7 @@
       </w:rPr>
     </w:lvl>
   </w:abstractNum>
-  <w:abstractNum w:abstractNumId="5" w15:restartNumberingAfterBreak="0">
+  <w:abstractNum w:abstractNumId="7" w15:restartNumberingAfterBreak="0">
     <w:nsid w:val="13CB00EA"/>
     <w:multiLevelType w:val="hybridMultilevel"/>
     <w:tmpl w:val="5E1E2DFC"/>
@@ -3958,7 +4598,7 @@
       </w:rPr>
     </w:lvl>
   </w:abstractNum>
-  <w:abstractNum w:abstractNumId="6" w15:restartNumberingAfterBreak="0">
+  <w:abstractNum w:abstractNumId="8" w15:restartNumberingAfterBreak="0">
     <w:nsid w:val="1D5C128E"/>
     <w:multiLevelType w:val="multilevel"/>
     <w:tmpl w:val="40508AA8"/>
@@ -4106,7 +4746,7 @@
       </w:rPr>
     </w:lvl>
   </w:abstractNum>
-  <w:abstractNum w:abstractNumId="7" w15:restartNumberingAfterBreak="0">
+  <w:abstractNum w:abstractNumId="9" w15:restartNumberingAfterBreak="0">
     <w:nsid w:val="1D7D02B4"/>
     <w:multiLevelType w:val="multilevel"/>
     <w:tmpl w:val="CCE4F7E8"/>
@@ -4219,7 +4859,7 @@
       </w:pPr>
     </w:lvl>
   </w:abstractNum>
-  <w:abstractNum w:abstractNumId="8" w15:restartNumberingAfterBreak="0">
+  <w:abstractNum w:abstractNumId="10" w15:restartNumberingAfterBreak="0">
     <w:nsid w:val="293D49D7"/>
     <w:multiLevelType w:val="multilevel"/>
     <w:tmpl w:val="08760F7C"/>
@@ -4368,7 +5008,7 @@
       </w:rPr>
     </w:lvl>
   </w:abstractNum>
-  <w:abstractNum w:abstractNumId="9" w15:restartNumberingAfterBreak="0">
+  <w:abstractNum w:abstractNumId="11" w15:restartNumberingAfterBreak="0">
     <w:nsid w:val="2C625FA9"/>
     <w:multiLevelType w:val="multilevel"/>
     <w:tmpl w:val="35485ED8"/>
@@ -4516,7 +5156,7 @@
       </w:rPr>
     </w:lvl>
   </w:abstractNum>
-  <w:abstractNum w:abstractNumId="10" w15:restartNumberingAfterBreak="0">
+  <w:abstractNum w:abstractNumId="12" w15:restartNumberingAfterBreak="0">
     <w:nsid w:val="30585891"/>
     <w:multiLevelType w:val="multilevel"/>
     <w:tmpl w:val="D534A97A"/>
@@ -4664,7 +5304,7 @@
       </w:rPr>
     </w:lvl>
   </w:abstractNum>
-  <w:abstractNum w:abstractNumId="11" w15:restartNumberingAfterBreak="0">
+  <w:abstractNum w:abstractNumId="13" w15:restartNumberingAfterBreak="0">
     <w:nsid w:val="32AF283E"/>
     <w:multiLevelType w:val="hybridMultilevel"/>
     <w:tmpl w:val="185A995A"/>
@@ -4776,7 +5416,7 @@
       </w:rPr>
     </w:lvl>
   </w:abstractNum>
-  <w:abstractNum w:abstractNumId="12" w15:restartNumberingAfterBreak="0">
+  <w:abstractNum w:abstractNumId="14" w15:restartNumberingAfterBreak="0">
     <w:nsid w:val="3A4111D1"/>
     <w:multiLevelType w:val="multilevel"/>
     <w:tmpl w:val="622CA53A"/>
@@ -4925,7 +5565,7 @@
       </w:rPr>
     </w:lvl>
   </w:abstractNum>
-  <w:abstractNum w:abstractNumId="13" w15:restartNumberingAfterBreak="0">
+  <w:abstractNum w:abstractNumId="15" w15:restartNumberingAfterBreak="0">
     <w:nsid w:val="3B061D23"/>
     <w:multiLevelType w:val="multilevel"/>
     <w:tmpl w:val="41DC2364"/>
@@ -5073,7 +5713,7 @@
       </w:rPr>
     </w:lvl>
   </w:abstractNum>
-  <w:abstractNum w:abstractNumId="14" w15:restartNumberingAfterBreak="0">
+  <w:abstractNum w:abstractNumId="16" w15:restartNumberingAfterBreak="0">
     <w:nsid w:val="3C497965"/>
     <w:multiLevelType w:val="hybridMultilevel"/>
     <w:tmpl w:val="B0AA1518"/>
@@ -5185,7 +5825,7 @@
       </w:rPr>
     </w:lvl>
   </w:abstractNum>
-  <w:abstractNum w:abstractNumId="15" w15:restartNumberingAfterBreak="0">
+  <w:abstractNum w:abstractNumId="17" w15:restartNumberingAfterBreak="0">
     <w:nsid w:val="3C6409CC"/>
     <w:multiLevelType w:val="hybridMultilevel"/>
     <w:tmpl w:val="232814B4"/>
@@ -5297,7 +5937,7 @@
       </w:rPr>
     </w:lvl>
   </w:abstractNum>
-  <w:abstractNum w:abstractNumId="16" w15:restartNumberingAfterBreak="0">
+  <w:abstractNum w:abstractNumId="18" w15:restartNumberingAfterBreak="0">
     <w:nsid w:val="42DE7B68"/>
     <w:multiLevelType w:val="hybridMultilevel"/>
     <w:tmpl w:val="42541EB8"/>
@@ -5408,7 +6048,7 @@
       </w:rPr>
     </w:lvl>
   </w:abstractNum>
-  <w:abstractNum w:abstractNumId="17" w15:restartNumberingAfterBreak="0">
+  <w:abstractNum w:abstractNumId="19" w15:restartNumberingAfterBreak="0">
     <w:nsid w:val="484B2F73"/>
     <w:multiLevelType w:val="multilevel"/>
     <w:tmpl w:val="F0C452BA"/>
@@ -5557,7 +6197,7 @@
       </w:rPr>
     </w:lvl>
   </w:abstractNum>
-  <w:abstractNum w:abstractNumId="18" w15:restartNumberingAfterBreak="0">
+  <w:abstractNum w:abstractNumId="20" w15:restartNumberingAfterBreak="0">
     <w:nsid w:val="51641ECA"/>
     <w:multiLevelType w:val="multilevel"/>
     <w:tmpl w:val="40FC65B0"/>
@@ -5705,7 +6345,7 @@
       </w:rPr>
     </w:lvl>
   </w:abstractNum>
-  <w:abstractNum w:abstractNumId="19" w15:restartNumberingAfterBreak="0">
+  <w:abstractNum w:abstractNumId="21" w15:restartNumberingAfterBreak="0">
     <w:nsid w:val="53D14AC0"/>
     <w:multiLevelType w:val="hybridMultilevel"/>
     <w:tmpl w:val="B420BC16"/>
@@ -5816,7 +6456,7 @@
       </w:rPr>
     </w:lvl>
   </w:abstractNum>
-  <w:abstractNum w:abstractNumId="20" w15:restartNumberingAfterBreak="0">
+  <w:abstractNum w:abstractNumId="22" w15:restartNumberingAfterBreak="0">
     <w:nsid w:val="57A06C45"/>
     <w:multiLevelType w:val="hybridMultilevel"/>
     <w:tmpl w:val="85B6170E"/>
@@ -5927,7 +6567,7 @@
       </w:rPr>
     </w:lvl>
   </w:abstractNum>
-  <w:abstractNum w:abstractNumId="21" w15:restartNumberingAfterBreak="0">
+  <w:abstractNum w:abstractNumId="23" w15:restartNumberingAfterBreak="0">
     <w:nsid w:val="5B04632F"/>
     <w:multiLevelType w:val="multilevel"/>
     <w:tmpl w:val="95928D68"/>
@@ -6076,7 +6716,7 @@
       </w:rPr>
     </w:lvl>
   </w:abstractNum>
-  <w:abstractNum w:abstractNumId="22" w15:restartNumberingAfterBreak="0">
+  <w:abstractNum w:abstractNumId="24" w15:restartNumberingAfterBreak="0">
     <w:nsid w:val="5B4C396D"/>
     <w:multiLevelType w:val="multilevel"/>
     <w:tmpl w:val="758AB0E0"/>
@@ -6225,7 +6865,7 @@
       </w:rPr>
     </w:lvl>
   </w:abstractNum>
-  <w:abstractNum w:abstractNumId="23" w15:restartNumberingAfterBreak="0">
+  <w:abstractNum w:abstractNumId="25" w15:restartNumberingAfterBreak="0">
     <w:nsid w:val="65617481"/>
     <w:multiLevelType w:val="multilevel"/>
     <w:tmpl w:val="7400AE28"/>
@@ -6374,7 +7014,7 @@
       </w:rPr>
     </w:lvl>
   </w:abstractNum>
-  <w:abstractNum w:abstractNumId="24" w15:restartNumberingAfterBreak="0">
+  <w:abstractNum w:abstractNumId="26" w15:restartNumberingAfterBreak="0">
     <w:nsid w:val="66230801"/>
     <w:multiLevelType w:val="multilevel"/>
     <w:tmpl w:val="7CC616AE"/>
@@ -6523,7 +7163,7 @@
       </w:rPr>
     </w:lvl>
   </w:abstractNum>
-  <w:abstractNum w:abstractNumId="25" w15:restartNumberingAfterBreak="0">
+  <w:abstractNum w:abstractNumId="27" w15:restartNumberingAfterBreak="0">
     <w:nsid w:val="69425928"/>
     <w:multiLevelType w:val="multilevel"/>
     <w:tmpl w:val="2D50DC86"/>
@@ -6672,7 +7312,7 @@
       </w:rPr>
     </w:lvl>
   </w:abstractNum>
-  <w:abstractNum w:abstractNumId="26" w15:restartNumberingAfterBreak="0">
+  <w:abstractNum w:abstractNumId="28" w15:restartNumberingAfterBreak="0">
     <w:nsid w:val="704964CA"/>
     <w:multiLevelType w:val="multilevel"/>
     <w:tmpl w:val="E30AA2A2"/>
@@ -6821,7 +7461,7 @@
       </w:rPr>
     </w:lvl>
   </w:abstractNum>
-  <w:abstractNum w:abstractNumId="27" w15:restartNumberingAfterBreak="0">
+  <w:abstractNum w:abstractNumId="29" w15:restartNumberingAfterBreak="0">
     <w:nsid w:val="704F50A6"/>
     <w:multiLevelType w:val="hybridMultilevel"/>
     <w:tmpl w:val="520887B6"/>
@@ -6933,7 +7573,7 @@
       </w:rPr>
     </w:lvl>
   </w:abstractNum>
-  <w:abstractNum w:abstractNumId="28" w15:restartNumberingAfterBreak="0">
+  <w:abstractNum w:abstractNumId="30" w15:restartNumberingAfterBreak="0">
     <w:nsid w:val="75A221B8"/>
     <w:multiLevelType w:val="multilevel"/>
     <w:tmpl w:val="F8289E24"/>
@@ -7081,7 +7721,7 @@
       </w:rPr>
     </w:lvl>
   </w:abstractNum>
-  <w:abstractNum w:abstractNumId="29" w15:restartNumberingAfterBreak="0">
+  <w:abstractNum w:abstractNumId="31" w15:restartNumberingAfterBreak="0">
     <w:nsid w:val="776F2A02"/>
     <w:multiLevelType w:val="multilevel"/>
     <w:tmpl w:val="9F6C6E24"/>
@@ -7230,7 +7870,7 @@
       </w:rPr>
     </w:lvl>
   </w:abstractNum>
-  <w:abstractNum w:abstractNumId="30" w15:restartNumberingAfterBreak="0">
+  <w:abstractNum w:abstractNumId="32" w15:restartNumberingAfterBreak="0">
     <w:nsid w:val="77820ECA"/>
     <w:multiLevelType w:val="multilevel"/>
     <w:tmpl w:val="1BC6EF24"/>
@@ -7379,7 +8019,7 @@
       </w:rPr>
     </w:lvl>
   </w:abstractNum>
-  <w:abstractNum w:abstractNumId="31" w15:restartNumberingAfterBreak="0">
+  <w:abstractNum w:abstractNumId="33" w15:restartNumberingAfterBreak="0">
     <w:nsid w:val="7822711B"/>
     <w:multiLevelType w:val="multilevel"/>
     <w:tmpl w:val="E47CEBD4"/>
@@ -7528,7 +8168,7 @@
       </w:rPr>
     </w:lvl>
   </w:abstractNum>
-  <w:abstractNum w:abstractNumId="32" w15:restartNumberingAfterBreak="0">
+  <w:abstractNum w:abstractNumId="34" w15:restartNumberingAfterBreak="0">
     <w:nsid w:val="7B472638"/>
     <w:multiLevelType w:val="hybridMultilevel"/>
     <w:tmpl w:val="B2AA9DDA"/>
@@ -7640,7 +8280,7 @@
       </w:rPr>
     </w:lvl>
   </w:abstractNum>
-  <w:abstractNum w:abstractNumId="33" w15:restartNumberingAfterBreak="0">
+  <w:abstractNum w:abstractNumId="35" w15:restartNumberingAfterBreak="0">
     <w:nsid w:val="7C701F01"/>
     <w:multiLevelType w:val="multilevel"/>
     <w:tmpl w:val="429EFBCE"/>
@@ -7789,7 +8429,7 @@
       </w:rPr>
     </w:lvl>
   </w:abstractNum>
-  <w:abstractNum w:abstractNumId="34" w15:restartNumberingAfterBreak="0">
+  <w:abstractNum w:abstractNumId="36" w15:restartNumberingAfterBreak="0">
     <w:nsid w:val="7C7F591F"/>
     <w:multiLevelType w:val="multilevel"/>
     <w:tmpl w:val="74C63178"/>
@@ -7938,108 +8578,114 @@
     </w:lvl>
   </w:abstractNum>
   <w:num w:numId="1" w16cid:durableId="576940856">
+    <w:abstractNumId w:val="10"/>
+  </w:num>
+  <w:num w:numId="2" w16cid:durableId="165750929">
+    <w:abstractNumId w:val="9"/>
+  </w:num>
+  <w:num w:numId="3" w16cid:durableId="1798600968">
+    <w:abstractNumId w:val="12"/>
+  </w:num>
+  <w:num w:numId="4" w16cid:durableId="290593790">
+    <w:abstractNumId w:val="19"/>
+  </w:num>
+  <w:num w:numId="5" w16cid:durableId="1747071183">
+    <w:abstractNumId w:val="20"/>
+  </w:num>
+  <w:num w:numId="6" w16cid:durableId="1370228320">
+    <w:abstractNumId w:val="35"/>
+  </w:num>
+  <w:num w:numId="7" w16cid:durableId="277487264">
+    <w:abstractNumId w:val="11"/>
+  </w:num>
+  <w:num w:numId="8" w16cid:durableId="1786385874">
+    <w:abstractNumId w:val="32"/>
+  </w:num>
+  <w:num w:numId="9" w16cid:durableId="1094789677">
+    <w:abstractNumId w:val="6"/>
+  </w:num>
+  <w:num w:numId="10" w16cid:durableId="1798327939">
+    <w:abstractNumId w:val="31"/>
+  </w:num>
+  <w:num w:numId="11" w16cid:durableId="1970738784">
     <w:abstractNumId w:val="8"/>
   </w:num>
-  <w:num w:numId="2" w16cid:durableId="165750929">
-    <w:abstractNumId w:val="7"/>
-  </w:num>
-  <w:num w:numId="3" w16cid:durableId="1798600968">
-    <w:abstractNumId w:val="10"/>
-  </w:num>
-  <w:num w:numId="4" w16cid:durableId="290593790">
-    <w:abstractNumId w:val="17"/>
-  </w:num>
-  <w:num w:numId="5" w16cid:durableId="1747071183">
-    <w:abstractNumId w:val="18"/>
-  </w:num>
-  <w:num w:numId="6" w16cid:durableId="1370228320">
-    <w:abstractNumId w:val="33"/>
-  </w:num>
-  <w:num w:numId="7" w16cid:durableId="277487264">
-    <w:abstractNumId w:val="9"/>
-  </w:num>
-  <w:num w:numId="8" w16cid:durableId="1786385874">
-    <w:abstractNumId w:val="30"/>
-  </w:num>
-  <w:num w:numId="9" w16cid:durableId="1094789677">
-    <w:abstractNumId w:val="4"/>
-  </w:num>
-  <w:num w:numId="10" w16cid:durableId="1798327939">
-    <w:abstractNumId w:val="29"/>
-  </w:num>
-  <w:num w:numId="11" w16cid:durableId="1970738784">
-    <w:abstractNumId w:val="6"/>
-  </w:num>
   <w:num w:numId="12" w16cid:durableId="1067143456">
-    <w:abstractNumId w:val="25"/>
+    <w:abstractNumId w:val="27"/>
   </w:num>
   <w:num w:numId="13" w16cid:durableId="2126651600">
-    <w:abstractNumId w:val="32"/>
+    <w:abstractNumId w:val="34"/>
   </w:num>
   <w:num w:numId="14" w16cid:durableId="571084812">
     <w:abstractNumId w:val="2"/>
   </w:num>
   <w:num w:numId="15" w16cid:durableId="1549564808">
-    <w:abstractNumId w:val="23"/>
+    <w:abstractNumId w:val="25"/>
   </w:num>
   <w:num w:numId="16" w16cid:durableId="284316941">
+    <w:abstractNumId w:val="15"/>
+  </w:num>
+  <w:num w:numId="17" w16cid:durableId="469784584">
+    <w:abstractNumId w:val="14"/>
+  </w:num>
+  <w:num w:numId="18" w16cid:durableId="487285797">
     <w:abstractNumId w:val="13"/>
   </w:num>
-  <w:num w:numId="17" w16cid:durableId="469784584">
-    <w:abstractNumId w:val="12"/>
-  </w:num>
-  <w:num w:numId="18" w16cid:durableId="487285797">
-    <w:abstractNumId w:val="11"/>
-  </w:num>
   <w:num w:numId="19" w16cid:durableId="1837067783">
-    <w:abstractNumId w:val="20"/>
+    <w:abstractNumId w:val="22"/>
   </w:num>
   <w:num w:numId="20" w16cid:durableId="1595478943">
+    <w:abstractNumId w:val="28"/>
+  </w:num>
+  <w:num w:numId="21" w16cid:durableId="1975478088">
+    <w:abstractNumId w:val="29"/>
+  </w:num>
+  <w:num w:numId="22" w16cid:durableId="1705710341">
+    <w:abstractNumId w:val="21"/>
+  </w:num>
+  <w:num w:numId="23" w16cid:durableId="1212496685">
     <w:abstractNumId w:val="26"/>
   </w:num>
-  <w:num w:numId="21" w16cid:durableId="1975478088">
-    <w:abstractNumId w:val="27"/>
+  <w:num w:numId="24" w16cid:durableId="953556951">
+    <w:abstractNumId w:val="36"/>
   </w:num>
-  <w:num w:numId="22" w16cid:durableId="1705710341">
-    <w:abstractNumId w:val="19"/>
-  </w:num>
-  <w:num w:numId="23" w16cid:durableId="1212496685">
+  <w:num w:numId="25" w16cid:durableId="5979712">
     <w:abstractNumId w:val="24"/>
   </w:num>
-  <w:num w:numId="24" w16cid:durableId="953556951">
-    <w:abstractNumId w:val="34"/>
-  </w:num>
-  <w:num w:numId="25" w16cid:durableId="5979712">
-    <w:abstractNumId w:val="22"/>
-  </w:num>
   <w:num w:numId="26" w16cid:durableId="1604344125">
-    <w:abstractNumId w:val="14"/>
+    <w:abstractNumId w:val="16"/>
   </w:num>
   <w:num w:numId="27" w16cid:durableId="398673461">
-    <w:abstractNumId w:val="16"/>
+    <w:abstractNumId w:val="18"/>
   </w:num>
   <w:num w:numId="28" w16cid:durableId="404576113">
     <w:abstractNumId w:val="1"/>
   </w:num>
   <w:num w:numId="29" w16cid:durableId="152917656">
-    <w:abstractNumId w:val="15"/>
+    <w:abstractNumId w:val="17"/>
   </w:num>
   <w:num w:numId="30" w16cid:durableId="1289703692">
-    <w:abstractNumId w:val="3"/>
+    <w:abstractNumId w:val="4"/>
   </w:num>
   <w:num w:numId="31" w16cid:durableId="707334847">
-    <w:abstractNumId w:val="21"/>
+    <w:abstractNumId w:val="23"/>
   </w:num>
   <w:num w:numId="32" w16cid:durableId="1877545152">
-    <w:abstractNumId w:val="31"/>
+    <w:abstractNumId w:val="33"/>
   </w:num>
   <w:num w:numId="33" w16cid:durableId="1071198340">
-    <w:abstractNumId w:val="28"/>
+    <w:abstractNumId w:val="30"/>
   </w:num>
   <w:num w:numId="34" w16cid:durableId="811480061">
     <w:abstractNumId w:val="0"/>
   </w:num>
   <w:num w:numId="35" w16cid:durableId="452408880">
+    <w:abstractNumId w:val="7"/>
+  </w:num>
+  <w:num w:numId="36" w16cid:durableId="846596217">
+    <w:abstractNumId w:val="3"/>
+  </w:num>
+  <w:num w:numId="37" w16cid:durableId="343482242">
     <w:abstractNumId w:val="5"/>
   </w:num>
 </w:numbering>
@@ -9003,6 +9649,17 @@
     <w:uiPriority w:val="99"/>
     <w:rsid w:val="00784FA2"/>
   </w:style>
+  <w:style w:type="paragraph" w:styleId="NormalWeb">
+    <w:name w:val="Normal (Web)"/>
+    <w:basedOn w:val="Normal"/>
+    <w:uiPriority w:val="99"/>
+    <w:semiHidden/>
+    <w:unhideWhenUsed/>
+    <w:rsid w:val="0069646B"/>
+    <w:rPr>
+      <w:rFonts w:ascii="Times New Roman" w:hAnsi="Times New Roman" w:cs="Times New Roman"/>
+    </w:rPr>
+  </w:style>
 </w:styles>
 </file>
 

</xml_diff>